<commit_message>
Convert all equations in Supplementary Information to native Word OpenXML oMath equations matching main manuscript
</commit_message>
<xml_diff>
--- a/supplementary/Supplementary_Information.docx
+++ b/supplementary/Supplementary_Information.docx
@@ -40,8 +40,8 @@
     </w:p>
     <w:p>
       <w:pPr>
-        <w:spacing w:before="80" w:after="80"/>
-        <w:jc w:val="center"/>
+        <w:spacing w:before="80" w:after="80" w:line="276" w:lineRule="auto"/>
+        <w:jc w:val="both"/>
       </w:pPr>
       <w:bookmarkStart w:id="0" w:name="_GoBack"/>
       <w:bookmarkEnd w:id="0"/>
@@ -55,8 +55,8 @@
     </w:p>
     <w:p>
       <w:pPr>
-        <w:spacing w:before="80" w:after="80"/>
-        <w:jc w:val="center"/>
+        <w:spacing w:before="80" w:after="80" w:line="276" w:lineRule="auto"/>
+        <w:jc w:val="both"/>
       </w:pPr>
       <w:r>
         <w:rPr>
@@ -91,7 +91,7 @@
     <w:p/>
     <w:p>
       <w:pPr>
-        <w:spacing w:before="80" w:after="80"/>
+        <w:spacing w:before="80" w:after="80" w:line="276" w:lineRule="auto"/>
         <w:jc w:val="both"/>
       </w:pPr>
       <w:r>
@@ -106,7 +106,7 @@
     </w:p>
     <w:p>
       <w:pPr>
-        <w:spacing w:before="80" w:after="80"/>
+        <w:spacing w:before="80" w:after="80" w:line="276" w:lineRule="auto"/>
         <w:ind w:left="360"/>
         <w:jc w:val="both"/>
       </w:pPr>
@@ -121,7 +121,7 @@
     </w:p>
     <w:p>
       <w:pPr>
-        <w:spacing w:before="80" w:after="80"/>
+        <w:spacing w:before="80" w:after="80" w:line="276" w:lineRule="auto"/>
         <w:ind w:left="360"/>
         <w:jc w:val="both"/>
       </w:pPr>
@@ -136,7 +136,7 @@
     </w:p>
     <w:p>
       <w:pPr>
-        <w:spacing w:before="80" w:after="80"/>
+        <w:spacing w:before="80" w:after="80" w:line="276" w:lineRule="auto"/>
         <w:ind w:left="360"/>
         <w:jc w:val="both"/>
       </w:pPr>
@@ -151,7 +151,7 @@
     </w:p>
     <w:p>
       <w:pPr>
-        <w:spacing w:before="80" w:after="80"/>
+        <w:spacing w:before="80" w:after="80" w:line="276" w:lineRule="auto"/>
         <w:ind w:left="360"/>
         <w:jc w:val="both"/>
       </w:pPr>
@@ -166,7 +166,7 @@
     </w:p>
     <w:p>
       <w:pPr>
-        <w:spacing w:before="80" w:after="80"/>
+        <w:spacing w:before="80" w:after="80" w:line="276" w:lineRule="auto"/>
         <w:ind w:left="360"/>
         <w:jc w:val="both"/>
       </w:pPr>
@@ -181,7 +181,7 @@
     </w:p>
     <w:p>
       <w:pPr>
-        <w:spacing w:before="80" w:after="80"/>
+        <w:spacing w:before="80" w:after="80" w:line="276" w:lineRule="auto"/>
         <w:ind w:left="360"/>
         <w:jc w:val="both"/>
       </w:pPr>
@@ -196,7 +196,7 @@
     </w:p>
     <w:p>
       <w:pPr>
-        <w:spacing w:before="80" w:after="80"/>
+        <w:spacing w:before="80" w:after="80" w:line="276" w:lineRule="auto"/>
         <w:ind w:left="360"/>
         <w:jc w:val="both"/>
       </w:pPr>
@@ -211,7 +211,7 @@
     </w:p>
     <w:p>
       <w:pPr>
-        <w:spacing w:before="80" w:after="80"/>
+        <w:spacing w:before="80" w:after="80" w:line="276" w:lineRule="auto"/>
         <w:ind w:left="360"/>
         <w:jc w:val="both"/>
       </w:pPr>
@@ -226,7 +226,7 @@
     </w:p>
     <w:p>
       <w:pPr>
-        <w:spacing w:before="80" w:after="80"/>
+        <w:spacing w:before="80" w:after="80" w:line="276" w:lineRule="auto"/>
         <w:ind w:left="360"/>
         <w:jc w:val="both"/>
       </w:pPr>
@@ -246,13 +246,14 @@
     </w:p>
     <w:p>
       <w:pPr>
-        <w:spacing w:before="80" w:after="80"/>
-        <w:jc w:val="both"/>
+        <w:spacing w:before="280" w:after="120" w:line="276" w:lineRule="auto"/>
+        <w:jc w:val="left"/>
       </w:pPr>
       <w:r>
         <w:rPr>
           <w:rFonts w:ascii="Times New Roman" w:hAnsi="Times New Roman"/>
           <w:b/>
+          <w:i w:val="0"/>
           <w:color w:val="000000"/>
           <w:sz w:val="24"/>
         </w:rPr>
@@ -262,7 +263,7 @@
     </w:p>
     <w:p>
       <w:pPr>
-        <w:spacing w:before="80" w:after="80"/>
+        <w:spacing w:before="80" w:after="80" w:line="276" w:lineRule="auto"/>
         <w:jc w:val="both"/>
         <w:rPr>
           <w:rFonts w:ascii="Times New Roman" w:hAnsi="Times New Roman"/>
@@ -295,7 +296,7 @@
     </w:p>
     <w:p>
       <w:pPr>
-        <w:spacing w:before="80" w:after="80"/>
+        <w:spacing w:before="0" w:after="120" w:line="276" w:lineRule="auto"/>
         <w:jc w:val="both"/>
         <w:rPr>
           <w:rFonts w:ascii="Times New Roman" w:hAnsi="Times New Roman"/>
@@ -305,46 +306,85 @@
       <w:r>
         <w:rPr>
           <w:rFonts w:ascii="Times New Roman" w:hAnsi="Times New Roman"/>
+          <w:b w:val="0"/>
+          <w:i w:val="0"/>
           <w:color w:val="000000"/>
+          <w:sz w:val="22"/>
         </w:rPr>
-        <w:br/>
-        <w:t>Let i denote a candidate transcription factor, e denote an accessible enhancer locus, and j denote a downstream target gene. The triangulated causal regulatory weight W_</w:t>
-      </w:r>
-      <w:proofErr w:type="gramStart"/>
-      <w:r>
-        <w:rPr>
-          <w:rFonts w:ascii="Times New Roman" w:hAnsi="Times New Roman"/>
-          <w:color w:val="000000"/>
-        </w:rPr>
-        <w:t>causal(</w:t>
-      </w:r>
-      <w:proofErr w:type="gramEnd"/>
-      <w:r>
-        <w:rPr>
-          <w:rFonts w:ascii="Times New Roman" w:hAnsi="Times New Roman"/>
-          <w:color w:val="000000"/>
-        </w:rPr>
-        <w:t>i → e → j) is formulated as the composite product of physical binding confidence and functional perturbation responsiveness:</w:t>
-      </w:r>
-      <w:r>
-        <w:rPr>
-          <w:rFonts w:ascii="Times New Roman" w:hAnsi="Times New Roman"/>
-          <w:color w:val="000000"/>
-        </w:rPr>
-        <w:br/>
-      </w:r>
-      <w:r>
-        <w:rPr>
-          <w:rFonts w:ascii="Times New Roman" w:hAnsi="Times New Roman"/>
-          <w:color w:val="000000"/>
-        </w:rPr>
-        <w:br/>
-        <w:t xml:space="preserve">        W_causal(i → e → j) = C_ChIP(i, e) × |log2 FC(e, j)| × |t(e, j)|</w:t>
+        <w:t>Let i denote a candidate transcription factor, e denote an accessible enhancer locus, and j denote a downstream target gene. The triangulated causal regulatory weight W_causal(i → e → j) is formulated as the composite product of physical binding confidence and functional perturbation responsiveness:</w:t>
       </w:r>
     </w:p>
     <w:p>
       <w:pPr>
-        <w:spacing w:before="80" w:after="80"/>
+        <w:spacing w:before="160" w:after="160"/>
+        <w:jc w:val="center"/>
+      </w:pPr>
+      <m:oMath xmlns:mml="http://www.w3.org/1998/Math/MathML">
+        <m:sSub>
+          <m:e>
+            <m:r>
+              <m:t>W</m:t>
+            </m:r>
+          </m:e>
+          <m:sub>
+            <m:r>
+              <m:rPr>
+                <m:nor/>
+              </m:rPr>
+              <m:t>causal</m:t>
+            </m:r>
+          </m:sub>
+        </m:sSub>
+        <m:r>
+          <m:t>(i→e→j)=</m:t>
+        </m:r>
+        <m:sSub>
+          <m:e>
+            <m:r>
+              <m:t>C</m:t>
+            </m:r>
+          </m:e>
+          <m:sub>
+            <m:r>
+              <m:rPr>
+                <m:nor/>
+              </m:rPr>
+              <m:t>ChIP</m:t>
+            </m:r>
+          </m:sub>
+        </m:sSub>
+        <m:r>
+          <m:t>(i,e)×|</m:t>
+        </m:r>
+        <m:sSub>
+          <m:e>
+            <m:r>
+              <m:rPr>
+                <m:sty m:val="p"/>
+              </m:rPr>
+              <m:t>log</m:t>
+            </m:r>
+          </m:e>
+          <m:sub>
+            <m:r>
+              <m:t>2</m:t>
+            </m:r>
+          </m:sub>
+        </m:sSub>
+        <m:r>
+          <m:rPr>
+            <m:nor/>
+          </m:rPr>
+          <m:t>FC</m:t>
+        </m:r>
+        <m:r>
+          <m:t>(e,j)|×|t(e,j)|</m:t>
+        </m:r>
+      </m:oMath>
+    </w:p>
+    <w:p>
+      <w:pPr>
+        <w:spacing w:before="80" w:after="80" w:line="276" w:lineRule="auto"/>
         <w:jc w:val="both"/>
       </w:pPr>
       <w:r>
@@ -373,13 +413,14 @@
     </w:p>
     <w:p>
       <w:pPr>
-        <w:spacing w:before="80" w:after="80"/>
-        <w:jc w:val="both"/>
+        <w:spacing w:before="280" w:after="120" w:line="276" w:lineRule="auto"/>
+        <w:jc w:val="left"/>
       </w:pPr>
       <w:r>
         <w:rPr>
           <w:rFonts w:ascii="Times New Roman" w:hAnsi="Times New Roman"/>
           <w:b/>
+          <w:i w:val="0"/>
           <w:color w:val="000000"/>
           <w:sz w:val="24"/>
         </w:rPr>
@@ -388,7 +429,7 @@
     </w:p>
     <w:p>
       <w:pPr>
-        <w:spacing w:before="80" w:after="80"/>
+        <w:spacing w:before="0" w:after="120" w:line="276" w:lineRule="auto"/>
         <w:jc w:val="both"/>
         <w:rPr>
           <w:rFonts w:ascii="Times New Roman" w:hAnsi="Times New Roman"/>
@@ -398,45 +439,88 @@
       <w:r>
         <w:rPr>
           <w:rFonts w:ascii="Times New Roman" w:hAnsi="Times New Roman"/>
+          <w:b w:val="0"/>
+          <w:i w:val="0"/>
           <w:color w:val="000000"/>
+          <w:sz w:val="22"/>
         </w:rPr>
         <w:t>Traditional observational GRN algorithms can only identify graphs up to their Markov Equivalence Class (represented as Completed Partially Directed Acyclic Graphs, CPDAGs), leaving edge directions reversible in v-structures without randomized interventions. Under Judea Pearl’s structural causal model (SCM) framework, experimental CRISPRi perturbations act as exogenous, randomized atomic interventions:</w:t>
-      </w:r>
-      <w:r>
-        <w:rPr>
-          <w:rFonts w:ascii="Times New Roman" w:hAnsi="Times New Roman"/>
-          <w:color w:val="000000"/>
-        </w:rPr>
-        <w:br/>
-      </w:r>
-      <w:r>
-        <w:rPr>
-          <w:rFonts w:ascii="Times New Roman" w:hAnsi="Times New Roman"/>
-          <w:color w:val="000000"/>
-        </w:rPr>
-        <w:br/>
-        <w:t xml:space="preserve">        </w:t>
-      </w:r>
-      <w:proofErr w:type="gramStart"/>
-      <w:r>
-        <w:rPr>
-          <w:rFonts w:ascii="Times New Roman" w:hAnsi="Times New Roman"/>
-          <w:color w:val="000000"/>
-        </w:rPr>
-        <w:t>P(</w:t>
-      </w:r>
-      <w:proofErr w:type="gramEnd"/>
-      <w:r>
-        <w:rPr>
-          <w:rFonts w:ascii="Times New Roman" w:hAnsi="Times New Roman"/>
-          <w:color w:val="000000"/>
-        </w:rPr>
-        <w:t>Y_j | do(E_e = 0)) ≠ P(Y_j | E_e = 0)</w:t>
       </w:r>
     </w:p>
     <w:p>
       <w:pPr>
-        <w:spacing w:before="80" w:after="80"/>
+        <w:spacing w:before="160" w:after="160"/>
+        <w:jc w:val="center"/>
+      </w:pPr>
+      <m:oMath xmlns:mml="http://www.w3.org/1998/Math/MathML">
+        <m:r>
+          <m:t>P(</m:t>
+        </m:r>
+        <m:sSub>
+          <m:e>
+            <m:r>
+              <m:t>Y</m:t>
+            </m:r>
+          </m:e>
+          <m:sub>
+            <m:r>
+              <m:t>j</m:t>
+            </m:r>
+          </m:sub>
+        </m:sSub>
+        <m:r>
+          <m:t>∣do(</m:t>
+        </m:r>
+        <m:sSub>
+          <m:e>
+            <m:r>
+              <m:t>E</m:t>
+            </m:r>
+          </m:e>
+          <m:sub>
+            <m:r>
+              <m:t>e</m:t>
+            </m:r>
+          </m:sub>
+        </m:sSub>
+        <m:r>
+          <m:t>=0))≠P(</m:t>
+        </m:r>
+        <m:sSub>
+          <m:e>
+            <m:r>
+              <m:t>Y</m:t>
+            </m:r>
+          </m:e>
+          <m:sub>
+            <m:r>
+              <m:t>j</m:t>
+            </m:r>
+          </m:sub>
+        </m:sSub>
+        <m:r>
+          <m:t>∣</m:t>
+        </m:r>
+        <m:sSub>
+          <m:e>
+            <m:r>
+              <m:t>E</m:t>
+            </m:r>
+          </m:e>
+          <m:sub>
+            <m:r>
+              <m:t>e</m:t>
+            </m:r>
+          </m:sub>
+        </m:sSub>
+        <m:r>
+          <m:t>=0)</m:t>
+        </m:r>
+      </m:oMath>
+    </w:p>
+    <w:p>
+      <w:pPr>
+        <w:spacing w:before="80" w:after="80" w:line="276" w:lineRule="auto"/>
         <w:jc w:val="both"/>
         <w:rPr>
           <w:rFonts w:ascii="Times New Roman" w:hAnsi="Times New Roman"/>
@@ -454,7 +538,7 @@
     </w:p>
     <w:p>
       <w:pPr>
-        <w:spacing w:before="80" w:after="80"/>
+        <w:spacing w:before="80" w:after="80" w:line="276" w:lineRule="auto"/>
         <w:jc w:val="both"/>
         <w:rPr>
           <w:rFonts w:ascii="Times New Roman" w:hAnsi="Times New Roman"/>
@@ -488,13 +572,14 @@
     </w:p>
     <w:p>
       <w:pPr>
-        <w:spacing w:before="80" w:after="80"/>
-        <w:jc w:val="both"/>
+        <w:spacing w:before="280" w:after="120" w:line="276" w:lineRule="auto"/>
+        <w:jc w:val="left"/>
       </w:pPr>
       <w:r>
         <w:rPr>
           <w:rFonts w:ascii="Times New Roman" w:hAnsi="Times New Roman"/>
           <w:b/>
+          <w:i w:val="0"/>
           <w:color w:val="000000"/>
           <w:sz w:val="24"/>
         </w:rPr>
@@ -503,7 +588,7 @@
     </w:p>
     <w:p>
       <w:pPr>
-        <w:spacing w:before="80" w:after="80"/>
+        <w:spacing w:before="80" w:after="80" w:line="276" w:lineRule="auto"/>
         <w:jc w:val="both"/>
         <w:rPr>
           <w:rFonts w:ascii="Times New Roman" w:hAnsi="Times New Roman"/>
@@ -536,7 +621,160 @@
     </w:p>
     <w:p>
       <w:pPr>
-        <w:spacing w:before="80" w:after="80"/>
+        <w:spacing w:before="160" w:after="160"/>
+        <w:jc w:val="center"/>
+        <w:rPr>
+          <w:rFonts w:ascii="Times New Roman" w:hAnsi="Times New Roman"/>
+          <w:color w:val="000000"/>
+        </w:rPr>
+      </w:pPr>
+      <w:r/>
+      <m:oMath xmlns:mml="http://www.w3.org/1998/Math/MathML">
+        <m:r>
+          <m:t>t=</m:t>
+        </m:r>
+        <m:f>
+          <m:fPr>
+            <m:type m:val="bar"/>
+          </m:fPr>
+          <m:num>
+            <m:sSub>
+              <m:e>
+                <m:bar>
+                  <m:barPr>
+                    <m:pos m:val="top"/>
+                  </m:barPr>
+                  <m:e>
+                    <m:r>
+                      <m:t>X</m:t>
+                    </m:r>
+                  </m:e>
+                </m:bar>
+              </m:e>
+              <m:sub>
+                <m:r>
+                  <m:t>1</m:t>
+                </m:r>
+              </m:sub>
+            </m:sSub>
+            <m:r>
+              <m:t>−</m:t>
+            </m:r>
+            <m:sSub>
+              <m:e>
+                <m:bar>
+                  <m:barPr>
+                    <m:pos m:val="top"/>
+                  </m:barPr>
+                  <m:e>
+                    <m:r>
+                      <m:t>X</m:t>
+                    </m:r>
+                  </m:e>
+                </m:bar>
+              </m:e>
+              <m:sub>
+                <m:r>
+                  <m:t>0</m:t>
+                </m:r>
+              </m:sub>
+            </m:sSub>
+          </m:num>
+          <m:den>
+            <m:rad>
+              <m:radPr>
+                <m:degHide m:val="on"/>
+              </m:radPr>
+              <m:deg/>
+              <m:e>
+                <m:f>
+                  <m:fPr>
+                    <m:type m:val="bar"/>
+                  </m:fPr>
+                  <m:num>
+                    <m:sSubSup>
+                      <m:e>
+                        <m:r>
+                          <m:t>s</m:t>
+                        </m:r>
+                      </m:e>
+                      <m:sub>
+                        <m:r>
+                          <m:t>1</m:t>
+                        </m:r>
+                      </m:sub>
+                      <m:sup>
+                        <m:r>
+                          <m:t>2</m:t>
+                        </m:r>
+                      </m:sup>
+                    </m:sSubSup>
+                  </m:num>
+                  <m:den>
+                    <m:sSub>
+                      <m:e>
+                        <m:r>
+                          <m:t>n</m:t>
+                        </m:r>
+                      </m:e>
+                      <m:sub>
+                        <m:r>
+                          <m:t>1</m:t>
+                        </m:r>
+                      </m:sub>
+                    </m:sSub>
+                  </m:den>
+                </m:f>
+                <m:r>
+                  <m:t>+</m:t>
+                </m:r>
+                <m:f>
+                  <m:fPr>
+                    <m:type m:val="bar"/>
+                  </m:fPr>
+                  <m:num>
+                    <m:sSubSup>
+                      <m:e>
+                        <m:r>
+                          <m:t>s</m:t>
+                        </m:r>
+                      </m:e>
+                      <m:sub>
+                        <m:r>
+                          <m:t>0</m:t>
+                        </m:r>
+                      </m:sub>
+                      <m:sup>
+                        <m:r>
+                          <m:t>2</m:t>
+                        </m:r>
+                      </m:sup>
+                    </m:sSubSup>
+                  </m:num>
+                  <m:den>
+                    <m:sSub>
+                      <m:e>
+                        <m:r>
+                          <m:t>n</m:t>
+                        </m:r>
+                      </m:e>
+                      <m:sub>
+                        <m:r>
+                          <m:t>0</m:t>
+                        </m:r>
+                      </m:sub>
+                    </m:sSub>
+                  </m:den>
+                </m:f>
+              </m:e>
+            </m:rad>
+          </m:den>
+        </m:f>
+      </m:oMath>
+    </w:p>
+    <w:p>
+      <w:pPr>
+        <w:spacing w:before="0" w:after="120" w:line="276" w:lineRule="auto"/>
         <w:jc w:val="both"/>
         <w:rPr>
           <w:rFonts w:ascii="Times New Roman" w:hAnsi="Times New Roman"/>
@@ -546,80 +784,276 @@
       <w:r>
         <w:rPr>
           <w:rFonts w:ascii="Times New Roman" w:hAnsi="Times New Roman"/>
+          <w:b w:val="0"/>
+          <w:i w:val="0"/>
           <w:color w:val="000000"/>
+          <w:sz w:val="22"/>
         </w:rPr>
-        <w:br/>
-        <w:t xml:space="preserve">        t = (X̄_1 - X̄_0) / </w:t>
-      </w:r>
-      <w:proofErr w:type="gramStart"/>
-      <w:r>
-        <w:rPr>
-          <w:rFonts w:ascii="Times New Roman" w:hAnsi="Times New Roman"/>
-          <w:color w:val="000000"/>
-        </w:rPr>
-        <w:t>√(</w:t>
-      </w:r>
-      <w:proofErr w:type="gramEnd"/>
-      <w:r>
-        <w:rPr>
-          <w:rFonts w:ascii="Times New Roman" w:hAnsi="Times New Roman"/>
-          <w:color w:val="000000"/>
-        </w:rPr>
-        <w:t xml:space="preserve"> (s_1² / n_1) + (s_0² / n_0) )</w:t>
+        <w:t>The effective degrees of freedom (ν) are computed via the Welch–Satterthwaite equation:</w:t>
       </w:r>
     </w:p>
     <w:p>
       <w:pPr>
-        <w:spacing w:before="80" w:after="80"/>
-        <w:jc w:val="both"/>
-        <w:rPr>
-          <w:rFonts w:ascii="Times New Roman" w:hAnsi="Times New Roman"/>
-          <w:color w:val="000000"/>
-        </w:rPr>
+        <w:spacing w:before="160" w:after="160"/>
+        <w:jc w:val="center"/>
       </w:pPr>
-      <w:r>
-        <w:rPr>
-          <w:rFonts w:ascii="Times New Roman" w:hAnsi="Times New Roman"/>
-          <w:color w:val="000000"/>
-        </w:rPr>
-        <w:br/>
-        <w:t>The effective degrees of freedom (ν) are computed via the Welch-Satterthwaite equation:</w:t>
-      </w:r>
-      <w:r>
-        <w:rPr>
-          <w:rFonts w:ascii="Times New Roman" w:hAnsi="Times New Roman"/>
-          <w:color w:val="000000"/>
-        </w:rPr>
-        <w:br/>
-      </w:r>
-      <w:r>
-        <w:rPr>
-          <w:rFonts w:ascii="Times New Roman" w:hAnsi="Times New Roman"/>
-          <w:color w:val="000000"/>
-        </w:rPr>
-        <w:br/>
-        <w:t xml:space="preserve">        ν ≈ </w:t>
-      </w:r>
-      <w:proofErr w:type="gramStart"/>
-      <w:r>
-        <w:rPr>
-          <w:rFonts w:ascii="Times New Roman" w:hAnsi="Times New Roman"/>
-          <w:color w:val="000000"/>
-        </w:rPr>
-        <w:t>[ (</w:t>
-      </w:r>
-      <w:proofErr w:type="gramEnd"/>
-      <w:r>
-        <w:rPr>
-          <w:rFonts w:ascii="Times New Roman" w:hAnsi="Times New Roman"/>
-          <w:color w:val="000000"/>
-        </w:rPr>
-        <w:t>s_1² / n_1) + (s_0² / n_0) ]² / [ (s_1² / n_1)² / (n_1 - 1) + (s_0² / n_0)² / (n_0 - 1) ]</w:t>
-      </w:r>
+      <m:oMath xmlns:mml="http://www.w3.org/1998/Math/MathML">
+        <m:r>
+          <m:t>ν≈</m:t>
+        </m:r>
+        <m:f>
+          <m:fPr>
+            <m:type m:val="bar"/>
+          </m:fPr>
+          <m:num>
+            <m:sSup>
+              <m:e>
+                <m:r>
+                  <m:t>(</m:t>
+                </m:r>
+                <m:f>
+                  <m:fPr>
+                    <m:type m:val="bar"/>
+                  </m:fPr>
+                  <m:num>
+                    <m:sSubSup>
+                      <m:e>
+                        <m:r>
+                          <m:t>s</m:t>
+                        </m:r>
+                      </m:e>
+                      <m:sub>
+                        <m:r>
+                          <m:t>1</m:t>
+                        </m:r>
+                      </m:sub>
+                      <m:sup>
+                        <m:r>
+                          <m:t>2</m:t>
+                        </m:r>
+                      </m:sup>
+                    </m:sSubSup>
+                  </m:num>
+                  <m:den>
+                    <m:sSub>
+                      <m:e>
+                        <m:r>
+                          <m:t>n</m:t>
+                        </m:r>
+                      </m:e>
+                      <m:sub>
+                        <m:r>
+                          <m:t>1</m:t>
+                        </m:r>
+                      </m:sub>
+                    </m:sSub>
+                  </m:den>
+                </m:f>
+                <m:r>
+                  <m:t>+</m:t>
+                </m:r>
+                <m:f>
+                  <m:fPr>
+                    <m:type m:val="bar"/>
+                  </m:fPr>
+                  <m:num>
+                    <m:sSubSup>
+                      <m:e>
+                        <m:r>
+                          <m:t>s</m:t>
+                        </m:r>
+                      </m:e>
+                      <m:sub>
+                        <m:r>
+                          <m:t>0</m:t>
+                        </m:r>
+                      </m:sub>
+                      <m:sup>
+                        <m:r>
+                          <m:t>2</m:t>
+                        </m:r>
+                      </m:sup>
+                    </m:sSubSup>
+                  </m:num>
+                  <m:den>
+                    <m:sSub>
+                      <m:e>
+                        <m:r>
+                          <m:t>n</m:t>
+                        </m:r>
+                      </m:e>
+                      <m:sub>
+                        <m:r>
+                          <m:t>0</m:t>
+                        </m:r>
+                      </m:sub>
+                    </m:sSub>
+                  </m:den>
+                </m:f>
+                <m:r>
+                  <m:t>)</m:t>
+                </m:r>
+              </m:e>
+              <m:sup>
+                <m:r>
+                  <m:t>2</m:t>
+                </m:r>
+              </m:sup>
+            </m:sSup>
+          </m:num>
+          <m:den>
+            <m:f>
+              <m:fPr>
+                <m:type m:val="bar"/>
+              </m:fPr>
+              <m:num>
+                <m:r>
+                  <m:t>(</m:t>
+                </m:r>
+                <m:sSubSup>
+                  <m:e>
+                    <m:r>
+                      <m:t>s</m:t>
+                    </m:r>
+                  </m:e>
+                  <m:sub>
+                    <m:r>
+                      <m:t>1</m:t>
+                    </m:r>
+                  </m:sub>
+                  <m:sup>
+                    <m:r>
+                      <m:t>2</m:t>
+                    </m:r>
+                  </m:sup>
+                </m:sSubSup>
+                <m:r>
+                  <m:t>/</m:t>
+                </m:r>
+                <m:sSub>
+                  <m:e>
+                    <m:r>
+                      <m:t>n</m:t>
+                    </m:r>
+                  </m:e>
+                  <m:sub>
+                    <m:r>
+                      <m:t>1</m:t>
+                    </m:r>
+                  </m:sub>
+                </m:sSub>
+                <m:sSup>
+                  <m:e>
+                    <m:r>
+                      <m:t>)</m:t>
+                    </m:r>
+                  </m:e>
+                  <m:sup>
+                    <m:r>
+                      <m:t>2</m:t>
+                    </m:r>
+                  </m:sup>
+                </m:sSup>
+              </m:num>
+              <m:den>
+                <m:sSub>
+                  <m:e>
+                    <m:r>
+                      <m:t>n</m:t>
+                    </m:r>
+                  </m:e>
+                  <m:sub>
+                    <m:r>
+                      <m:t>1</m:t>
+                    </m:r>
+                  </m:sub>
+                </m:sSub>
+                <m:r>
+                  <m:t>−1</m:t>
+                </m:r>
+              </m:den>
+            </m:f>
+            <m:r>
+              <m:t>+</m:t>
+            </m:r>
+            <m:f>
+              <m:fPr>
+                <m:type m:val="bar"/>
+              </m:fPr>
+              <m:num>
+                <m:r>
+                  <m:t>(</m:t>
+                </m:r>
+                <m:sSubSup>
+                  <m:e>
+                    <m:r>
+                      <m:t>s</m:t>
+                    </m:r>
+                  </m:e>
+                  <m:sub>
+                    <m:r>
+                      <m:t>0</m:t>
+                    </m:r>
+                  </m:sub>
+                  <m:sup>
+                    <m:r>
+                      <m:t>2</m:t>
+                    </m:r>
+                  </m:sup>
+                </m:sSubSup>
+                <m:r>
+                  <m:t>/</m:t>
+                </m:r>
+                <m:sSub>
+                  <m:e>
+                    <m:r>
+                      <m:t>n</m:t>
+                    </m:r>
+                  </m:e>
+                  <m:sub>
+                    <m:r>
+                      <m:t>0</m:t>
+                    </m:r>
+                  </m:sub>
+                </m:sSub>
+                <m:sSup>
+                  <m:e>
+                    <m:r>
+                      <m:t>)</m:t>
+                    </m:r>
+                  </m:e>
+                  <m:sup>
+                    <m:r>
+                      <m:t>2</m:t>
+                    </m:r>
+                  </m:sup>
+                </m:sSup>
+              </m:num>
+              <m:den>
+                <m:sSub>
+                  <m:e>
+                    <m:r>
+                      <m:t>n</m:t>
+                    </m:r>
+                  </m:e>
+                  <m:sub>
+                    <m:r>
+                      <m:t>0</m:t>
+                    </m:r>
+                  </m:sub>
+                </m:sSub>
+                <m:r>
+                  <m:t>−1</m:t>
+                </m:r>
+              </m:den>
+            </m:f>
+          </m:den>
+        </m:f>
+      </m:oMath>
     </w:p>
     <w:p>
       <w:pPr>
-        <w:spacing w:before="80" w:after="80"/>
+        <w:spacing w:before="80" w:after="80" w:line="276" w:lineRule="auto"/>
         <w:jc w:val="both"/>
       </w:pPr>
       <w:r>
@@ -633,13 +1067,14 @@
     </w:p>
     <w:p>
       <w:pPr>
-        <w:spacing w:before="80" w:after="80"/>
-        <w:jc w:val="both"/>
+        <w:spacing w:before="280" w:after="120" w:line="276" w:lineRule="auto"/>
+        <w:jc w:val="left"/>
       </w:pPr>
       <w:r>
         <w:rPr>
           <w:rFonts w:ascii="Times New Roman" w:hAnsi="Times New Roman"/>
           <w:b/>
+          <w:i w:val="0"/>
           <w:color w:val="000000"/>
           <w:sz w:val="24"/>
         </w:rPr>
@@ -648,7 +1083,7 @@
     </w:p>
     <w:p>
       <w:pPr>
-        <w:spacing w:before="80" w:after="80"/>
+        <w:spacing w:before="80" w:after="80" w:line="276" w:lineRule="auto"/>
         <w:jc w:val="both"/>
         <w:rPr>
           <w:rFonts w:ascii="Times New Roman" w:hAnsi="Times New Roman"/>
@@ -665,41 +1100,93 @@
     </w:p>
     <w:p>
       <w:pPr>
-        <w:spacing w:before="80" w:after="80"/>
-        <w:jc w:val="both"/>
+        <w:spacing w:before="160" w:after="160"/>
+        <w:jc w:val="center"/>
         <w:rPr>
           <w:rFonts w:ascii="Times New Roman" w:hAnsi="Times New Roman"/>
           <w:color w:val="000000"/>
         </w:rPr>
       </w:pPr>
-      <w:r>
-        <w:rPr>
-          <w:rFonts w:ascii="Times New Roman" w:hAnsi="Times New Roman"/>
-          <w:color w:val="000000"/>
-        </w:rPr>
-        <w:br/>
-        <w:t xml:space="preserve">        </w:t>
-      </w:r>
-      <w:proofErr w:type="gramStart"/>
-      <w:r>
-        <w:rPr>
-          <w:rFonts w:ascii="Times New Roman" w:hAnsi="Times New Roman"/>
-          <w:color w:val="000000"/>
-        </w:rPr>
-        <w:t>PR(</w:t>
-      </w:r>
-      <w:proofErr w:type="gramEnd"/>
-      <w:r>
-        <w:rPr>
-          <w:rFonts w:ascii="Times New Roman" w:hAnsi="Times New Roman"/>
-          <w:color w:val="000000"/>
-        </w:rPr>
-        <w:t>u) = (1 - α) / N + α ∑_{v ∈ In(u)} [ PR(v) / L(v) ]</w:t>
-      </w:r>
+      <w:r/>
+      <m:oMath xmlns:mml="http://www.w3.org/1998/Math/MathML">
+        <m:r>
+          <m:rPr>
+            <m:nor/>
+          </m:rPr>
+          <m:t>PR</m:t>
+        </m:r>
+        <m:r>
+          <m:t>(u)=</m:t>
+        </m:r>
+        <m:f>
+          <m:fPr>
+            <m:type m:val="bar"/>
+          </m:fPr>
+          <m:num>
+            <m:r>
+              <m:t>1−α</m:t>
+            </m:r>
+          </m:num>
+          <m:den>
+            <m:r>
+              <m:t>N</m:t>
+            </m:r>
+          </m:den>
+        </m:f>
+        <m:r>
+          <m:t>+α</m:t>
+        </m:r>
+        <m:nary>
+          <m:naryPr>
+            <m:chr m:val="∑"/>
+            <m:limLoc m:val="subSup"/>
+            <m:grow m:val="1"/>
+            <m:subHide m:val="off"/>
+            <m:supHide m:val="on"/>
+          </m:naryPr>
+          <m:sub>
+            <m:r>
+              <m:t>v∈</m:t>
+            </m:r>
+            <m:r>
+              <m:rPr>
+                <m:nor/>
+              </m:rPr>
+              <m:t>In</m:t>
+            </m:r>
+            <m:r>
+              <m:t>(u)</m:t>
+            </m:r>
+          </m:sub>
+          <m:sup/>
+          <m:e/>
+        </m:nary>
+        <m:f>
+          <m:fPr>
+            <m:type m:val="bar"/>
+          </m:fPr>
+          <m:num>
+            <m:r>
+              <m:rPr>
+                <m:nor/>
+              </m:rPr>
+              <m:t>PR</m:t>
+            </m:r>
+            <m:r>
+              <m:t>(v)</m:t>
+            </m:r>
+          </m:num>
+          <m:den>
+            <m:r>
+              <m:t>L(v)</m:t>
+            </m:r>
+          </m:den>
+        </m:f>
+      </m:oMath>
     </w:p>
     <w:p>
       <w:pPr>
-        <w:spacing w:before="80" w:after="80"/>
+        <w:spacing w:before="80" w:after="80" w:line="276" w:lineRule="auto"/>
         <w:jc w:val="both"/>
         <w:rPr>
           <w:rFonts w:ascii="Times New Roman" w:hAnsi="Times New Roman"/>
@@ -732,41 +1219,47 @@
     </w:p>
     <w:p>
       <w:pPr>
-        <w:spacing w:before="80" w:after="80"/>
-        <w:jc w:val="both"/>
+        <w:spacing w:before="160" w:after="160"/>
+        <w:jc w:val="center"/>
         <w:rPr>
           <w:rFonts w:ascii="Times New Roman" w:hAnsi="Times New Roman"/>
           <w:color w:val="000000"/>
         </w:rPr>
       </w:pPr>
-      <w:r>
-        <w:rPr>
-          <w:rFonts w:ascii="Times New Roman" w:hAnsi="Times New Roman"/>
-          <w:color w:val="000000"/>
-        </w:rPr>
-        <w:br/>
-        <w:t xml:space="preserve">        </w:t>
-      </w:r>
-      <w:proofErr w:type="gramStart"/>
-      <w:r>
-        <w:rPr>
-          <w:rFonts w:ascii="Times New Roman" w:hAnsi="Times New Roman"/>
-          <w:color w:val="000000"/>
-        </w:rPr>
-        <w:t>MRS(</w:t>
-      </w:r>
-      <w:proofErr w:type="gramEnd"/>
-      <w:r>
-        <w:rPr>
-          <w:rFonts w:ascii="Times New Roman" w:hAnsi="Times New Roman"/>
-          <w:color w:val="000000"/>
-        </w:rPr>
-        <w:t>i) = β × TargetPercentile(i) + (1 - β) × WeightPercentile(i)</w:t>
-      </w:r>
+      <w:r/>
+      <m:oMath xmlns:mml="http://www.w3.org/1998/Math/MathML">
+        <m:r>
+          <m:rPr>
+            <m:nor/>
+          </m:rPr>
+          <m:t>MRS</m:t>
+        </m:r>
+        <m:r>
+          <m:t>(i)=β×</m:t>
+        </m:r>
+        <m:r>
+          <m:rPr>
+            <m:nor/>
+          </m:rPr>
+          <m:t>TargetPercentile</m:t>
+        </m:r>
+        <m:r>
+          <m:t>(i)+(1−β)×</m:t>
+        </m:r>
+        <m:r>
+          <m:rPr>
+            <m:nor/>
+          </m:rPr>
+          <m:t>WeightPercentile</m:t>
+        </m:r>
+        <m:r>
+          <m:t>(i)</m:t>
+        </m:r>
+      </m:oMath>
     </w:p>
     <w:p>
       <w:pPr>
-        <w:spacing w:before="80" w:after="80"/>
+        <w:spacing w:before="80" w:after="80" w:line="276" w:lineRule="auto"/>
         <w:jc w:val="both"/>
       </w:pPr>
       <w:r>
@@ -795,13 +1288,14 @@
     </w:p>
     <w:p>
       <w:pPr>
-        <w:spacing w:before="80" w:after="80"/>
-        <w:jc w:val="both"/>
+        <w:spacing w:before="280" w:after="120" w:line="276" w:lineRule="auto"/>
+        <w:jc w:val="left"/>
       </w:pPr>
       <w:r>
         <w:rPr>
           <w:rFonts w:ascii="Times New Roman" w:hAnsi="Times New Roman"/>
           <w:b/>
+          <w:i w:val="0"/>
           <w:color w:val="000000"/>
           <w:sz w:val="24"/>
         </w:rPr>
@@ -810,7 +1304,7 @@
     </w:p>
     <w:p>
       <w:pPr>
-        <w:spacing w:before="80" w:after="80"/>
+        <w:spacing w:before="0" w:after="120" w:line="276" w:lineRule="auto"/>
         <w:jc w:val="both"/>
         <w:rPr>
           <w:rFonts w:ascii="Times New Roman" w:hAnsi="Times New Roman"/>
@@ -820,46 +1314,104 @@
       <w:r>
         <w:rPr>
           <w:rFonts w:ascii="Times New Roman" w:hAnsi="Times New Roman"/>
+          <w:b w:val="0"/>
+          <w:i w:val="0"/>
           <w:color w:val="000000"/>
+          <w:sz w:val="22"/>
         </w:rPr>
         <w:t>To capture non-linear, multi-factorial causal gene regulation beyond monotonic assumptions, we deployed XGBoost Regressors predicting target gene responsiveness from master regulator causal weights. Exact feature attribution values were computed via the TreeExplainer algorithm:</w:t>
-      </w:r>
-      <w:r>
-        <w:rPr>
-          <w:rFonts w:ascii="Times New Roman" w:hAnsi="Times New Roman"/>
-          <w:color w:val="000000"/>
-        </w:rPr>
-        <w:br/>
-      </w:r>
-      <w:r>
-        <w:rPr>
-          <w:rFonts w:ascii="Times New Roman" w:hAnsi="Times New Roman"/>
-          <w:color w:val="000000"/>
-        </w:rPr>
-        <w:lastRenderedPageBreak/>
-        <w:br/>
-        <w:t xml:space="preserve">        φ_i(x) = ∑_{S ⊆ F \ {i}} [ |S|! (|F| - |S| - 1)! / |F|! ] × </w:t>
-      </w:r>
-      <w:proofErr w:type="gramStart"/>
-      <w:r>
-        <w:rPr>
-          <w:rFonts w:ascii="Times New Roman" w:hAnsi="Times New Roman"/>
-          <w:color w:val="000000"/>
-        </w:rPr>
-        <w:t>[ f</w:t>
-      </w:r>
-      <w:proofErr w:type="gramEnd"/>
-      <w:r>
-        <w:rPr>
-          <w:rFonts w:ascii="Times New Roman" w:hAnsi="Times New Roman"/>
-          <w:color w:val="000000"/>
-        </w:rPr>
-        <w:t>_x(S ∪ {i}) - f_x(S) ]</w:t>
       </w:r>
     </w:p>
     <w:p>
       <w:pPr>
-        <w:spacing w:before="80" w:after="80"/>
+        <w:spacing w:before="160" w:after="160"/>
+        <w:jc w:val="center"/>
+      </w:pPr>
+      <m:oMath xmlns:mml="http://www.w3.org/1998/Math/MathML">
+        <m:sSub>
+          <m:e>
+            <m:r>
+              <m:t>ϕ</m:t>
+            </m:r>
+          </m:e>
+          <m:sub>
+            <m:r>
+              <m:t>i</m:t>
+            </m:r>
+          </m:sub>
+        </m:sSub>
+        <m:r>
+          <m:t>(x)=</m:t>
+        </m:r>
+        <m:nary>
+          <m:naryPr>
+            <m:chr m:val="∑"/>
+            <m:limLoc m:val="subSup"/>
+            <m:grow m:val="1"/>
+            <m:subHide m:val="off"/>
+            <m:supHide m:val="on"/>
+          </m:naryPr>
+          <m:sub>
+            <m:r>
+              <m:t>S⊆F⧵{i}</m:t>
+            </m:r>
+          </m:sub>
+          <m:sup/>
+          <m:e/>
+        </m:nary>
+        <m:f>
+          <m:fPr>
+            <m:type m:val="bar"/>
+          </m:fPr>
+          <m:num>
+            <m:r>
+              <m:t>|S|!(|F|−|S|−1)!</m:t>
+            </m:r>
+          </m:num>
+          <m:den>
+            <m:r>
+              <m:t>|F|!</m:t>
+            </m:r>
+          </m:den>
+        </m:f>
+        <m:r>
+          <m:t>[</m:t>
+        </m:r>
+        <m:sSub>
+          <m:e>
+            <m:r>
+              <m:t>f</m:t>
+            </m:r>
+          </m:e>
+          <m:sub>
+            <m:r>
+              <m:t>x</m:t>
+            </m:r>
+          </m:sub>
+        </m:sSub>
+        <m:r>
+          <m:t>(S∪{i})−</m:t>
+        </m:r>
+        <m:sSub>
+          <m:e>
+            <m:r>
+              <m:t>f</m:t>
+            </m:r>
+          </m:e>
+          <m:sub>
+            <m:r>
+              <m:t>x</m:t>
+            </m:r>
+          </m:sub>
+        </m:sSub>
+        <m:r>
+          <m:t>(S)]</m:t>
+        </m:r>
+      </m:oMath>
+    </w:p>
+    <w:p>
+      <w:pPr>
+        <w:spacing w:before="80" w:after="80" w:line="276" w:lineRule="auto"/>
         <w:jc w:val="both"/>
       </w:pPr>
       <w:r>
@@ -888,13 +1440,14 @@
     </w:p>
     <w:p>
       <w:pPr>
-        <w:spacing w:before="80" w:after="80"/>
-        <w:jc w:val="both"/>
+        <w:spacing w:before="280" w:after="120" w:line="276" w:lineRule="auto"/>
+        <w:jc w:val="left"/>
       </w:pPr>
       <w:r>
         <w:rPr>
           <w:rFonts w:ascii="Times New Roman" w:hAnsi="Times New Roman"/>
           <w:b/>
+          <w:i w:val="0"/>
           <w:color w:val="000000"/>
           <w:sz w:val="24"/>
         </w:rPr>
@@ -903,7 +1456,7 @@
     </w:p>
     <w:p>
       <w:pPr>
-        <w:spacing w:before="80" w:after="80"/>
+        <w:spacing w:before="80" w:after="80" w:line="276" w:lineRule="auto"/>
         <w:jc w:val="both"/>
         <w:rPr>
           <w:rFonts w:ascii="Times New Roman" w:hAnsi="Times New Roman"/>
@@ -920,7 +1473,7 @@
     </w:p>
     <w:p>
       <w:pPr>
-        <w:spacing w:before="80" w:after="80"/>
+        <w:spacing w:before="80" w:after="80" w:line="276" w:lineRule="auto"/>
         <w:jc w:val="both"/>
         <w:rPr>
           <w:rFonts w:ascii="Times New Roman" w:hAnsi="Times New Roman"/>
@@ -938,7 +1491,7 @@
     </w:p>
     <w:p>
       <w:pPr>
-        <w:spacing w:before="80" w:after="80"/>
+        <w:spacing w:before="80" w:after="80" w:line="276" w:lineRule="auto"/>
         <w:jc w:val="both"/>
         <w:rPr>
           <w:rFonts w:ascii="Times New Roman" w:hAnsi="Times New Roman"/>
@@ -972,7 +1525,7 @@
     </w:p>
     <w:p>
       <w:pPr>
-        <w:spacing w:before="80" w:after="80"/>
+        <w:spacing w:before="80" w:after="80" w:line="276" w:lineRule="auto"/>
         <w:jc w:val="both"/>
       </w:pPr>
       <w:r>
@@ -987,7 +1540,7 @@
     <w:p/>
     <w:p>
       <w:pPr>
-        <w:spacing w:before="80" w:after="80"/>
+        <w:spacing w:before="80" w:after="80" w:line="276" w:lineRule="auto"/>
         <w:jc w:val="both"/>
       </w:pPr>
       <w:r>
@@ -1002,7 +1555,7 @@
     </w:p>
     <w:p>
       <w:pPr>
-        <w:spacing w:before="80" w:after="80"/>
+        <w:spacing w:before="80" w:after="80" w:line="276" w:lineRule="auto"/>
         <w:ind w:left="360"/>
         <w:jc w:val="both"/>
       </w:pPr>
@@ -1017,7 +1570,7 @@
     </w:p>
     <w:p>
       <w:pPr>
-        <w:spacing w:before="80" w:after="80"/>
+        <w:spacing w:before="80" w:after="80" w:line="276" w:lineRule="auto"/>
         <w:ind w:left="360"/>
         <w:jc w:val="both"/>
       </w:pPr>
@@ -1032,7 +1585,7 @@
     </w:p>
     <w:p>
       <w:pPr>
-        <w:spacing w:before="80" w:after="80"/>
+        <w:spacing w:before="80" w:after="80" w:line="276" w:lineRule="auto"/>
         <w:ind w:left="360"/>
         <w:jc w:val="both"/>
       </w:pPr>
@@ -1047,7 +1600,7 @@
     </w:p>
     <w:p>
       <w:pPr>
-        <w:spacing w:before="80" w:after="80"/>
+        <w:spacing w:before="80" w:after="80" w:line="276" w:lineRule="auto"/>
         <w:ind w:left="360"/>
         <w:jc w:val="both"/>
       </w:pPr>
@@ -1063,7 +1616,7 @@
     </w:p>
     <w:p>
       <w:pPr>
-        <w:spacing w:before="80" w:after="80"/>
+        <w:spacing w:before="80" w:after="80" w:line="276" w:lineRule="auto"/>
         <w:ind w:left="360"/>
         <w:jc w:val="both"/>
       </w:pPr>
@@ -1078,7 +1631,7 @@
     </w:p>
     <w:p>
       <w:pPr>
-        <w:spacing w:before="80" w:after="80"/>
+        <w:spacing w:before="80" w:after="80" w:line="276" w:lineRule="auto"/>
         <w:ind w:left="360"/>
         <w:jc w:val="both"/>
       </w:pPr>
@@ -1093,7 +1646,7 @@
     </w:p>
     <w:p>
       <w:pPr>
-        <w:spacing w:before="80" w:after="80"/>
+        <w:spacing w:before="80" w:after="80" w:line="276" w:lineRule="auto"/>
         <w:ind w:left="360"/>
         <w:jc w:val="both"/>
       </w:pPr>
@@ -1108,7 +1661,7 @@
     </w:p>
     <w:p>
       <w:pPr>
-        <w:spacing w:before="80" w:after="80"/>
+        <w:spacing w:before="80" w:after="80" w:line="276" w:lineRule="auto"/>
         <w:ind w:left="360"/>
         <w:jc w:val="both"/>
       </w:pPr>
@@ -1123,7 +1676,7 @@
     </w:p>
     <w:p>
       <w:pPr>
-        <w:spacing w:before="80" w:after="80"/>
+        <w:spacing w:before="80" w:after="80" w:line="276" w:lineRule="auto"/>
         <w:ind w:left="360"/>
         <w:jc w:val="both"/>
       </w:pPr>

</xml_diff>